<commit_message>
ilot practice data, hub map, and export findings
</commit_message>
<xml_diff>
--- a/assets/guides/Analysis_Choices_Explained.docx
+++ b/assets/guides/Analysis_Choices_Explained.docx
@@ -26857,7 +26857,7 @@
         <w:t xml:space="preserve">”</w:t>
       </w:r>
       <w:r>
-        <w:t xml:space="preserve">). Keep only the Shimmer’s rows (its EventSource column reads 1), because each export row holds one sample from one device. Remove samples equal to -1, the export’s no-value code (240 rows, about 1.9 s, in the pilot baseline), and samples equal to 0, which the lab record shows when the probe loses the pulse or the hand moves; inspect sudden jumps, which the lab record shows at 150 to 200 BPM with the probe off; set and write down numeric plausibility limits before real data.</w:t>
+        <w:t xml:space="preserve">). Keep only the Shimmer’s rows (its EventSource column reads 1), because the System Load Monitor and the slide events have rows of their own in the export, where the Shimmer columns are empty. Remove samples equal to -1, the export’s no-value code (240 rows, about 1.9 s, in the pilot baseline), and samples equal to 0, which the lab record shows when the probe loses the pulse or the hand moves; inspect sudden jumps, which the lab record shows at 150 to 200 BPM with the probe off; set and write down numeric plausibility limits before real data.</w:t>
       </w:r>
       <w:r>
         <w:t xml:space="preserve"> </w:t>
@@ -27145,7 +27145,7 @@
         <w:t xml:space="preserve"> </w:t>
       </w:r>
       <w:r>
-        <w:t xml:space="preserve">As above; Moment to moment statistics only if the binned description is wanted (with the same 5000 ms and 1000 ms settings as the notebook); annotation and scene options only if annotations or scenes exist. Not exported: ECG Metrics Export, Accelerometry Metrics Export, and Epoch Export, because their notebooks were not run. The effective Shimmer sampling rate should sit near 128 Hz (Workshop 4 reads the manual’s example Data Quality file as showing Shimmer GSR rates from 121 to 127). On October 12, 2026 the GSR Metrics files did not arrive (no save window appeared), so Peaks Per Minute for the pilot was computed from the Peak Occurrences column of the Sensor Data export: peaks per stimulus divided by its length in minutes, which equals the article’s definition when no gap is longer than 4 s. The Sensor Data file’s #INFO block lists the respondent’s name, age, and gender, so every export is stored as identifiable participant data.</w:t>
+        <w:t xml:space="preserve">As above; Moment to moment statistics only if the binned description is wanted (with the same 5000 ms and 1000 ms settings as the notebook); annotation and scene options only if annotations or scenes exist. Not exported: ECG Metrics Export, Accelerometry Metrics Export, and Epoch Export, because their notebooks were not run. The effective Shimmer sampling rate should sit near 128 Hz (Workshop 4 reads the manual’s example Data Quality file as showing Shimmer GSR rates from 121 to 127). On October 12, 2026 the GSR Metrics files did not arrive (no save window appeared), so Peaks Per Minute for the pilot was computed from the Peak Occurrences column of the Sensor Data export: peaks per stimulus divided by its length in minutes, which equals the article’s definition when no gap is longer than 4 s. The Sensor Data file’s #INFO block lists the respondent’s name, age, and gender, so every participant’s export is stored as identifiable data; the pilot file is the lab director’s own recording, published with his permission as practice data with Workshop 4 (https://marksciuchetti.github.io/JaxState_Behavior-Lab/assets/ws4/data/pilot/001_PILOT01.csv).</w:t>
       </w:r>
     </w:p>
     <w:p>
@@ -28429,7 +28429,22 @@
         <w:t xml:space="preserve"> </w:t>
       </w:r>
       <w:r>
-        <w:t xml:space="preserve">In a real Peak Metrics file, confirm that Peaks Per Minute equals Peak Count divided by Signal Duration in minutes, and that Has Peaks and NA amplitudes appear as described.</w:t>
+        <w:t xml:space="preserve">Partly settled: in the pilot’s GSRPeakMetrics.csv (October 12, 2026) Peaks Per Minute equals Peak Count divided by the interval length (8, 7.98, 7.99), and Signal Duration equals Duration because no gap exceeded 4 s. The file’s own description says the divisor is</w:t>
+      </w:r>
+      <w:r>
+        <w:t xml:space="preserve"> </w:t>
+      </w:r>
+      <w:r>
+        <w:t xml:space="preserve">“</w:t>
+      </w:r>
+      <w:r>
+        <w:t xml:space="preserve">Duration (ms)</w:t>
+      </w:r>
+      <w:r>
+        <w:t xml:space="preserve">”</w:t>
+      </w:r>
+      <w:r>
+        <w:t xml:space="preserve">, while the help article says Signal Duration; a recording with a gap longer than 4 s would show which one iMotions uses. How Has Peaks and NA amplitudes look for a stimulus with no peaks is still to be seen.</w:t>
       </w:r>
     </w:p>
     <w:p>
@@ -28451,7 +28466,13 @@
         <w:t xml:space="preserve"> </w:t>
       </w:r>
       <w:r>
-        <w:t xml:space="preserve">File names and formats (.txt or .csv) of the GSR Metrics, Signal Quality, and Respondent Statistics exports, and the layout of the Signal Quality file.</w:t>
+        <w:t xml:space="preserve">Settled for the GSR Metrics Export: on the lab computer in 11.1 it writes GSRPeakMetrics.csv and GSRPeakTable.csv into Documents</w:t>
+      </w:r>
+      <w:r>
+        <w:t xml:space="preserve">&lt;study&gt;</w:t>
+      </w:r>
+      <w:r>
+        <w:t xml:space="preserve">&lt;analysis&gt;, each headed by a #METADATA block (Channel identifier, Group, Unit, Short unit, Description, and for the metrics file Device, AlgorithmType, and Flow Name); a Sensor Data export from the analysis goes into a Sensor Data subfolder. Still open: the Signal Quality and Respondent Statistics files.</w:t>
       </w:r>
     </w:p>
     <w:p>
@@ -28613,7 +28634,7 @@
         <w:t xml:space="preserve"> </w:t>
       </w:r>
       <w:r>
-        <w:t xml:space="preserve">The files did not arrive on October 12, 2026; retry Export &gt; R PROCESSING &gt; GSR Metrics Export, and check that its Peaks Per Minute matches the value computed from the Sensor Data file.</w:t>
+        <w:t xml:space="preserve">Settled: the second try on October 12, 2026 wrote GSRPeakMetrics.csv and GSRPeakTable.csv, and their Peak Count, Peaks Per Minute, Average Peak Amplitude, and the 14 peak times match the values computed from the Sensor Data file exactly (pilot_analysis.R, step 13). Both files are published as practice data (https://marksciuchetti.github.io/JaxState_Behavior-Lab/workshops/workshop-04-shimmer-gsr-heart-rate.html#numbers).</w:t>
       </w:r>
     </w:p>
     <w:p>

</xml_diff>